<commit_message>
Verify Cell Theory against classroom sources and clarify principle order
</commit_message>
<xml_diff>
--- a/yusuf-study-site/public/quizzes/cells/concept-1/cell-theory-answer-key.docx
+++ b/yusuf-study-site/public/quizzes/cells/concept-1/cell-theory-answer-key.docx
@@ -121,7 +121,11 @@
     </w:p>
     <w:p>
       <w:r>
-        <w:t>1 → Part 1; 2 → Part 2; 3 → Part 3. Focus on what organisms are made of, the role of the cell, and the origin of new cells.</w:t>
+        <w:t>Plants and animals are made of cells → made of cells.</w:t>
+        <w:br/>
+        <w:t>Cells build organisms and carry out basic life functions → basic unit.</w:t>
+        <w:br/>
+        <w:t>A dividing cell produces new cells → cells from existing cells.</w:t>
       </w:r>
     </w:p>
     <w:p>

</xml_diff>